<commit_message>
adjust analysis docx untill august 04th
</commit_message>
<xml_diff>
--- a/CARTIS2_Analyse_April2026.docx
+++ b/CARTIS2_Analyse_April2026.docx
@@ -52,7 +52,7 @@
           <w:color w:val="606060"/>
           <w:sz w:val="22"/>
         </w:rPr>
-        <w:t>Versie: April 2026</w:t>
+        <w:t>Versie: April 2026 (bijgewerkt augustus 2026)</w:t>
       </w:r>
     </w:p>
     <w:p>
@@ -314,7 +314,7 @@
           </w:tcPr>
           <w:p>
             <w:r>
-              <w:t>PostgreSQL (met PostGIS extensie)</w:t>
+              <w:t>PostgreSQL + PostGIS, gehost op Supabase</w:t>
             </w:r>
           </w:p>
         </w:tc>
@@ -350,6 +350,29 @@
           </w:tcPr>
           <w:p>
             <w:r>
+              <w:t>Hosting / deployment</w:t>
+            </w:r>
+          </w:p>
+        </w:tc>
+        <w:tc>
+          <w:tcPr>
+            <w:tcW w:type="dxa" w:w="5760"/>
+          </w:tcPr>
+          <w:p>
+            <w:r>
+              <w:t>Vercel (serverless functions voor de API, statische build voor de front-end)</w:t>
+            </w:r>
+          </w:p>
+        </w:tc>
+      </w:tr>
+      <w:tr>
+        <w:tc>
+          <w:tcPr>
+            <w:tcW w:type="dxa" w:w="4032"/>
+            <w:shd w:val="clear" w:color="auto" w:fill="EEF4FB"/>
+          </w:tcPr>
+          <w:p>
+            <w:r>
               <w:t>Authenticatie</w:t>
             </w:r>
           </w:p>
@@ -357,6 +380,7 @@
         <w:tc>
           <w:tcPr>
             <w:tcW w:type="dxa" w:w="5760"/>
+            <w:shd w:val="clear" w:color="auto" w:fill="EEF4FB"/>
           </w:tcPr>
           <w:p>
             <w:r>
@@ -369,7 +393,6 @@
         <w:tc>
           <w:tcPr>
             <w:tcW w:type="dxa" w:w="4032"/>
-            <w:shd w:val="clear" w:color="auto" w:fill="EEF4FB"/>
           </w:tcPr>
           <w:p>
             <w:r>
@@ -380,11 +403,34 @@
         <w:tc>
           <w:tcPr>
             <w:tcW w:type="dxa" w:w="5760"/>
+          </w:tcPr>
+          <w:p>
+            <w:r>
+              <w:t>Helmet, CORS (express-validator staat als dependency, maar wordt nergens gebruikt)</w:t>
+            </w:r>
+          </w:p>
+        </w:tc>
+      </w:tr>
+      <w:tr>
+        <w:tc>
+          <w:tcPr>
+            <w:tcW w:type="dxa" w:w="4032"/>
             <w:shd w:val="clear" w:color="auto" w:fill="EEF4FB"/>
           </w:tcPr>
           <w:p>
             <w:r>
-              <w:t>Helmet, CORS, express-validator</w:t>
+              <w:t>File upload</w:t>
+            </w:r>
+          </w:p>
+        </w:tc>
+        <w:tc>
+          <w:tcPr>
+            <w:tcW w:type="dxa" w:w="5760"/>
+            <w:shd w:val="clear" w:color="auto" w:fill="EEF4FB"/>
+          </w:tcPr>
+          <w:p>
+            <w:r>
+              <w:t>Multer (max 50 MB; PDF, Office, afbeeldingen, XML, ZIP, CAD/GIS-formaten zoals DWG/DXF/Shapefile/GeoJSON/KML/GPX)</w:t>
             </w:r>
           </w:p>
         </w:tc>
@@ -396,7 +442,7 @@
           </w:tcPr>
           <w:p>
             <w:r>
-              <w:t>File upload</w:t>
+              <w:t>Bestandsopslag</w:t>
             </w:r>
           </w:p>
         </w:tc>
@@ -406,7 +452,7 @@
           </w:tcPr>
           <w:p>
             <w:r>
-              <w:t>Multer (max 10 MB; PDF, Office, afbeeldingen, XML, ZIP)</w:t>
+              <w:t>Supabase Storage (bucket "attachments") in productie; lokale /uploads/-map als fallback in lokale ontwikkeling</w:t>
             </w:r>
           </w:p>
         </w:tc>
@@ -430,7 +476,7 @@
           </w:tcPr>
           <w:p>
             <w:r>
-              <w:t>Nodemailer (nautinfo mailbox – config aanwezig)</w:t>
+              <w:t>Nodemailer als dependency aanwezig maar niet geïmplementeerd; e-mails (.msg/.eml) worden client-side ingelezen (msgreader/postal-mime) bij drag-and-drop</w:t>
             </w:r>
           </w:p>
         </w:tc>
@@ -614,7 +660,7 @@
           </w:tcPr>
           <w:p>
             <w:r>
-              <w:t>SunEditor (meldingen) / QuillEditor</w:t>
+              <w:t>SunEditor (meldingen, taken, commentaren, dashboard-notities)</w:t>
             </w:r>
           </w:p>
         </w:tc>
@@ -758,7 +804,7 @@
           <w:color w:val="222222"/>
           <w:sz w:val="18"/>
         </w:rPr>
-        <w:t>│   │   ├── routes/         # 8 route-modules (70+ endpoints)</w:t>
+        <w:t>│   │   ├── routes/         # 9 route-modules (78+ endpoints)</w:t>
       </w:r>
     </w:p>
     <w:p>
@@ -772,7 +818,7 @@
           <w:color w:val="222222"/>
           <w:sz w:val="18"/>
         </w:rPr>
-        <w:t>│   │   ├── services/       # Zone-detectie, HPD, productversies</w:t>
+        <w:t>│   │   ├── services/       # Zone-detectie, HPD, productversies, correctielijsten, opslag</w:t>
       </w:r>
     </w:p>
     <w:p>
@@ -961,7 +1007,7 @@
           <w:i w:val="0"/>
           <w:sz w:val="22"/>
         </w:rPr>
-        <w:t>De front-end (poort 5173 in dev) communiceert uitsluitend via HTTP(S) met de back-end REST API (poort 3000). Authenticatie verloopt via een Bearer JWT-token dat bij elke request meegestuurd wordt. De back-end beheert de verbinding met PostgreSQL via een connection pool.</w:t>
+        <w:t>De front-end (poort 5173 in dev) communiceert uitsluitend via HTTP(S) met de back-end REST API (poort 3000). Authenticatie verloopt via een Bearer JWT-token dat bij elke request meegestuurd wordt. De back-end beheert de verbinding met PostgreSQL via een connection pool. In productie draait de applicatie op Vercel; de database en de bijlage-opslag lopen via Supabase (PostgreSQL/PostGIS + Storage).</w:t>
       </w:r>
     </w:p>
     <w:p>
@@ -979,7 +1025,7 @@
         <w:ind w:left="360"/>
       </w:pPr>
       <w:r>
-        <w:t>REST API → PostgreSQL (parameterized queries via pg pool)</w:t>
+        <w:t>REST API → PostgreSQL/PostGIS op Supabase (parameterized queries via pg pool)</w:t>
       </w:r>
     </w:p>
     <w:p>
@@ -1006,7 +1052,7 @@
         <w:ind w:left="360"/>
       </w:pPr>
       <w:r>
-        <w:t>REST API → Filesystem (uploads/ map voor bijlagen)</w:t>
+        <w:t>REST API → Supabase Storage (bijlagen in productie) / lokale filesystem (uploads/ map in dev)</w:t>
       </w:r>
     </w:p>
     <w:p/>
@@ -1272,7 +1318,7 @@
           </w:tcPr>
           <w:p>
             <w:r>
-              <w:t>Gedetecteerde geografische zones bij een melding (automatisch + manueel)</w:t>
+              <w:t>Gedetecteerde geografische zones bij een melding (automatisch + manueel), gekoppeld aan products (type='zone') of kml_coverages</w:t>
             </w:r>
           </w:p>
         </w:tc>
@@ -1284,7 +1330,7 @@
           </w:tcPr>
           <w:p>
             <w:r>
-              <w:t>notification_flags</w:t>
+              <w:t>notification_info_requests</w:t>
             </w:r>
           </w:p>
         </w:tc>
@@ -1294,7 +1340,7 @@
           </w:tcPr>
           <w:p>
             <w:r>
-              <w:t>Vlaggen: MSI actief, opvolging nodig, extra info nodig</w:t>
+              <w:t>Informatie-aanvragen bij meldingen (metadata; geen automatische verzending)</w:t>
             </w:r>
           </w:p>
         </w:tc>
@@ -1318,7 +1364,7 @@
           </w:tcPr>
           <w:p>
             <w:r>
-              <w:t>Nautische producten (kaarten, publicaties) met GeoJSON-geometrie en productielijkoppeling</w:t>
+              <w:t>Nautische producten (kaarten, publicaties, zones) met GeoJSON-geometrie en productielijkoppeling</w:t>
             </w:r>
           </w:p>
         </w:tc>
@@ -1364,7 +1410,7 @@
           </w:tcPr>
           <w:p>
             <w:r>
-              <w:t>Taken (taaknummer YYNNN, titel, BaZ-nr, CARIS HPD-koppeling)</w:t>
+              <w:t>Taken (taaknummer YYNNN, titel, BaZ-nr, CARIS HPD-koppeling, vlaggen msi_active/needs_followup/needs_extra_info)</w:t>
             </w:r>
           </w:p>
         </w:tc>
@@ -1410,7 +1456,7 @@
           </w:tcPr>
           <w:p>
             <w:r>
-              <w:t>Koppeling taak ↔ product met status-tracking</w:t>
+              <w:t>Koppeling taak ↔ product met status- én execution_status-tracking</w:t>
             </w:r>
           </w:p>
         </w:tc>
@@ -1514,7 +1560,7 @@
           </w:tcPr>
           <w:p>
             <w:r>
-              <w:t>product_versions</w:t>
+              <w:t>task_info_requests</w:t>
             </w:r>
           </w:p>
         </w:tc>
@@ -1524,7 +1570,53 @@
           </w:tcPr>
           <w:p>
             <w:r>
+              <w:t>Informatie-aanvragen bij taken (metadata; geen automatische verzending)</w:t>
+            </w:r>
+          </w:p>
+        </w:tc>
+      </w:tr>
+      <w:tr>
+        <w:tc>
+          <w:tcPr>
+            <w:tcW w:type="dxa" w:w="3600"/>
+            <w:shd w:val="clear" w:color="auto" w:fill="EEF4FB"/>
+          </w:tcPr>
+          <w:p>
+            <w:r>
+              <w:t>product_versions</w:t>
+            </w:r>
+          </w:p>
+        </w:tc>
+        <w:tc>
+          <w:tcPr>
+            <w:tcW w:type="dxa" w:w="6192"/>
+            <w:shd w:val="clear" w:color="auto" w:fill="EEF4FB"/>
+          </w:tcPr>
+          <w:p>
+            <w:r>
               <w:t>Versies van een product (status: In Progress / Ready / Published)</w:t>
+            </w:r>
+          </w:p>
+        </w:tc>
+      </w:tr>
+      <w:tr>
+        <w:tc>
+          <w:tcPr>
+            <w:tcW w:type="dxa" w:w="3600"/>
+          </w:tcPr>
+          <w:p>
+            <w:r>
+              <w:t>product_version_attachments</w:t>
+            </w:r>
+          </w:p>
+        </w:tc>
+        <w:tc>
+          <w:tcPr>
+            <w:tcW w:type="dxa" w:w="6192"/>
+          </w:tcPr>
+          <w:p>
+            <w:r>
+              <w:t>Bijlagen per productversie</w:t>
             </w:r>
           </w:p>
         </w:tc>
@@ -1583,7 +1675,7 @@
           </w:tcPr>
           <w:p>
             <w:r>
-              <w:t>kml_coverages</w:t>
+              <w:t>kml_files / kml_coverages</w:t>
             </w:r>
           </w:p>
         </w:tc>
@@ -1594,7 +1686,7 @@
           </w:tcPr>
           <w:p>
             <w:r>
-              <w:t>Geïmporteerde KML-dekgebieden (zones)</w:t>
+              <w:t>Geïmporteerde KML-bestanden en hun individuele dekgebieden</w:t>
             </w:r>
           </w:p>
         </w:tc>
@@ -1629,7 +1721,7 @@
           </w:tcPr>
           <w:p>
             <w:r>
-              <w:t>activity_log</w:t>
+              <w:t>user_notes / user_note_production_lines</w:t>
             </w:r>
           </w:p>
         </w:tc>
@@ -1640,12 +1732,44 @@
           </w:tcPr>
           <w:p>
             <w:r>
+              <w:t>Persoonlijke dashboard-notities met prioriteit, zichtbaar per (gekozen) productielijn(en)</w:t>
+            </w:r>
+          </w:p>
+        </w:tc>
+      </w:tr>
+      <w:tr>
+        <w:tc>
+          <w:tcPr>
+            <w:tcW w:type="dxa" w:w="3600"/>
+          </w:tcPr>
+          <w:p>
+            <w:r>
+              <w:t>activity_log</w:t>
+            </w:r>
+          </w:p>
+        </w:tc>
+        <w:tc>
+          <w:tcPr>
+            <w:tcW w:type="dxa" w:w="6192"/>
+          </w:tcPr>
+          <w:p>
+            <w:r>
               <w:t>Audit trail van alle acties</w:t>
             </w:r>
           </w:p>
         </w:tc>
       </w:tr>
     </w:tbl>
+    <w:p>
+      <w:r>
+        <w:rPr>
+          <w:b w:val="0"/>
+          <w:i/>
+          <w:sz w:val="18"/>
+        </w:rPr>
+        <w:t>Let op: de vlaggen MSI actief / opvolging nodig / extra info nodig zijn kolommen op de tasks-tabel (msi_active, needs_followup, needs_extra_info) en geen aparte tabel.</w:t>
+      </w:r>
+    </w:p>
     <w:p>
       <w:pPr>
         <w:pStyle w:val="Heading2"/>
@@ -1711,7 +1835,7 @@
           <w:i w:val="0"/>
           <w:sz w:val="22"/>
         </w:rPr>
-        <w:t>Het schema is uitgebreid via 13 incrementele SQL-migratiescripts:</w:t>
+        <w:t>Het basisschema (schema.sql) is sindsdien uitgebreid via 27 incrementele SQL-migratiescripts (plus een geconsolideerd setup-complete.sql voor nieuwe Supabase-omgevingen). Belangrijkste migraties:</w:t>
       </w:r>
     </w:p>
     <w:tbl>
@@ -1878,7 +2002,7 @@
           </w:tcPr>
           <w:p>
             <w:r>
-              <w:t>add-notification-flags.sql</w:t>
+              <w:t>add-notification-zones.sql</w:t>
             </w:r>
           </w:p>
         </w:tc>
@@ -1889,7 +2013,7 @@
           </w:tcPr>
           <w:p>
             <w:r>
-              <w:t>Vlaggen (MSI, opvolging, extra info)</w:t>
+              <w:t>Zone-koppelingen bij meldingen</w:t>
             </w:r>
           </w:p>
         </w:tc>
@@ -1901,7 +2025,7 @@
           </w:tcPr>
           <w:p>
             <w:r>
-              <w:t>add-notification-zones.sql</w:t>
+              <w:t>add-notification-info-requests.sql</w:t>
             </w:r>
           </w:p>
         </w:tc>
@@ -1911,7 +2035,7 @@
           </w:tcPr>
           <w:p>
             <w:r>
-              <w:t>Zone-koppelingen bij meldingen</w:t>
+              <w:t>Informatie-aanvragen bij meldingen</w:t>
             </w:r>
           </w:p>
         </w:tc>
@@ -2039,7 +2163,7 @@
           </w:tcPr>
           <w:p>
             <w:r>
-              <w:t>add-article-titles.sql</w:t>
+              <w:t>add-wait-for-zk-to-task-production-line-status.sql</w:t>
             </w:r>
           </w:p>
         </w:tc>
@@ -2049,7 +2173,145 @@
           </w:tcPr>
           <w:p>
             <w:r>
+              <w:t>"Wacht op ZK"-status toegevoegd</w:t>
+            </w:r>
+          </w:p>
+        </w:tc>
+      </w:tr>
+      <w:tr>
+        <w:tc>
+          <w:tcPr>
+            <w:tcW w:type="dxa" w:w="4608"/>
+            <w:shd w:val="clear" w:color="auto" w:fill="EEF4FB"/>
+          </w:tcPr>
+          <w:p>
+            <w:r>
+              <w:t>add-article-titles.sql</w:t>
+            </w:r>
+          </w:p>
+        </w:tc>
+        <w:tc>
+          <w:tcPr>
+            <w:tcW w:type="dxa" w:w="5184"/>
+            <w:shd w:val="clear" w:color="auto" w:fill="EEF4FB"/>
+          </w:tcPr>
+          <w:p>
+            <w:r>
               <w:t>Titels voor artikelen</w:t>
+            </w:r>
+          </w:p>
+        </w:tc>
+      </w:tr>
+      <w:tr>
+        <w:tc>
+          <w:tcPr>
+            <w:tcW w:type="dxa" w:w="4608"/>
+          </w:tcPr>
+          <w:p>
+            <w:r>
+              <w:t>add-product-version-attachments.sql</w:t>
+            </w:r>
+          </w:p>
+        </w:tc>
+        <w:tc>
+          <w:tcPr>
+            <w:tcW w:type="dxa" w:w="5184"/>
+          </w:tcPr>
+          <w:p>
+            <w:r>
+              <w:t>Bijlagen per productversie</w:t>
+            </w:r>
+          </w:p>
+        </w:tc>
+      </w:tr>
+      <w:tr>
+        <w:tc>
+          <w:tcPr>
+            <w:tcW w:type="dxa" w:w="4608"/>
+            <w:shd w:val="clear" w:color="auto" w:fill="EEF4FB"/>
+          </w:tcPr>
+          <w:p>
+            <w:r>
+              <w:t>add-note-priority.sql</w:t>
+            </w:r>
+          </w:p>
+        </w:tc>
+        <w:tc>
+          <w:tcPr>
+            <w:tcW w:type="dxa" w:w="5184"/>
+            <w:shd w:val="clear" w:color="auto" w:fill="EEF4FB"/>
+          </w:tcPr>
+          <w:p>
+            <w:r>
+              <w:t>Prioriteit voor dashboard-notities</w:t>
+            </w:r>
+          </w:p>
+        </w:tc>
+      </w:tr>
+      <w:tr>
+        <w:tc>
+          <w:tcPr>
+            <w:tcW w:type="dxa" w:w="4608"/>
+          </w:tcPr>
+          <w:p>
+            <w:r>
+              <w:t>migrate-notification-zones-to-products.sql</w:t>
+            </w:r>
+          </w:p>
+        </w:tc>
+        <w:tc>
+          <w:tcPr>
+            <w:tcW w:type="dxa" w:w="5184"/>
+          </w:tcPr>
+          <w:p>
+            <w:r>
+              <w:t>Zone-detectie omgezet van kml_coverages naar products (type='zone')</w:t>
+            </w:r>
+          </w:p>
+        </w:tc>
+      </w:tr>
+      <w:tr>
+        <w:tc>
+          <w:tcPr>
+            <w:tcW w:type="dxa" w:w="4608"/>
+            <w:shd w:val="clear" w:color="auto" w:fill="EEF4FB"/>
+          </w:tcPr>
+          <w:p>
+            <w:r>
+              <w:t>add-be3vlbnk-zk-and-products-composite-unique.sql</w:t>
+            </w:r>
+          </w:p>
+        </w:tc>
+        <w:tc>
+          <w:tcPr>
+            <w:tcW w:type="dxa" w:w="5184"/>
+            <w:shd w:val="clear" w:color="auto" w:fill="EEF4FB"/>
+          </w:tcPr>
+          <w:p>
+            <w:r>
+              <w:t>Uniciteitsconstraint producten per productielijn</w:t>
+            </w:r>
+          </w:p>
+        </w:tc>
+      </w:tr>
+      <w:tr>
+        <w:tc>
+          <w:tcPr>
+            <w:tcW w:type="dxa" w:w="4608"/>
+          </w:tcPr>
+          <w:p>
+            <w:r>
+              <w:t>overige (7)</w:t>
+            </w:r>
+          </w:p>
+        </w:tc>
+        <w:tc>
+          <w:tcPr>
+            <w:tcW w:type="dxa" w:w="5184"/>
+          </w:tcPr>
+          <w:p>
+            <w:r>
+              <w:t>Backfill- en opruimscripts (task_production_line_status, product/taak-koppelingen, indexen, PostGIS-activatie, teststgebruiker)</w:t>
             </w:r>
           </w:p>
         </w:tc>
@@ -2083,7 +2345,7 @@
           <w:i w:val="0"/>
           <w:sz w:val="22"/>
         </w:rPr>
-        <w:t>De back-end biedt 70+ REST-endpoints gegroepeerd in 8 route-modules. Alle endpoints (behalve /api/auth/login en /health) zijn beveiligd met JWT-middleware.</w:t>
+        <w:t>De back-end biedt 78+ REST-endpoints gegroepeerd in 9 route-modules. Alle endpoints (behalve /api/auth/login en /health) zijn beveiligd met JWT-middleware.</w:t>
       </w:r>
     </w:p>
     <w:p>
@@ -2180,7 +2442,7 @@
           </w:tcPr>
           <w:p>
             <w:r>
-              <w:t>22 endpoints — CRUD meldingen, beslissingen, bulk-beslissing, commentaren, bijlagen, coördinaten, zone-detectie, product-detectie</w:t>
+              <w:t>24 endpoints — CRUD meldingen, beslissingen, bulk-beslissing, commentaren, info-aanvragen, bijlagen, coördinaten, zone-detectie, product-detectie</w:t>
             </w:r>
           </w:p>
         </w:tc>
@@ -2202,7 +2464,7 @@
           </w:tcPr>
           <w:p>
             <w:r>
-              <w:t>20 endpoints — CRUD taken, workflow, commentaren, artikelen, HPD-sync, productielijn-status, gerelateerde taken</w:t>
+              <w:t>25 endpoints — CRUD taken, workflow, commentaren, artikelen + vertaling, vlaggen, HPD-sync, productielijn-status, gerelateerde taken, doorlooptijden</w:t>
             </w:r>
           </w:p>
         </w:tc>
@@ -2226,7 +2488,7 @@
           </w:tcPr>
           <w:p>
             <w:r>
-              <w:t>8 endpoints — CRUD producten, koppelen/ontkoppelen aan meldingen, detectie op geometrie</w:t>
+              <w:t>9 endpoints — CRUD producten, koppelen/ontkoppelen aan meldingen, detectie op geometrie</w:t>
             </w:r>
           </w:p>
         </w:tc>
@@ -2248,7 +2510,7 @@
           </w:tcPr>
           <w:p>
             <w:r>
-              <w:t>6 endpoints — versies aanmaken, publiceren, taken koppelen, incomplete taken doorschuiven</w:t>
+              <w:t>11 endpoints — versies aanmaken, publiceren, taken koppelen, execution-status, incomplete taken doorschuiven, bijlagen</w:t>
             </w:r>
           </w:p>
         </w:tc>
@@ -2272,7 +2534,7 @@
           </w:tcPr>
           <w:p>
             <w:r>
-              <w:t>2 endpoints — lijst productielijnen</w:t>
+              <w:t>1 endpoint — lijst productielijnen</w:t>
             </w:r>
           </w:p>
         </w:tc>
@@ -2294,7 +2556,7 @@
           </w:tcPr>
           <w:p>
             <w:r>
-              <w:t>3 endpoints — lijst gebruikers, rechten</w:t>
+              <w:t>1 endpoint — lijst gebruikers</w:t>
             </w:r>
           </w:p>
         </w:tc>
@@ -2318,7 +2580,29 @@
           </w:tcPr>
           <w:p>
             <w:r>
-              <w:t>5 endpoints — KML-dekgebieden beheren</w:t>
+              <w:t>8 endpoints — KML-bestanden/dekgebieden/zones opzoeken en bevragen</w:t>
+            </w:r>
+          </w:p>
+        </w:tc>
+      </w:tr>
+      <w:tr>
+        <w:tc>
+          <w:tcPr>
+            <w:tcW w:type="dxa" w:w="3600"/>
+          </w:tcPr>
+          <w:p>
+            <w:r>
+              <w:t>/api/notes/*</w:t>
+            </w:r>
+          </w:p>
+        </w:tc>
+        <w:tc>
+          <w:tcPr>
+            <w:tcW w:type="dxa" w:w="6192"/>
+          </w:tcPr>
+          <w:p>
+            <w:r>
+              <w:t>5 endpoints — persoonlijke dashboard-notities (CRUD + productielijn-zichtbaarheid)</w:t>
             </w:r>
           </w:p>
         </w:tc>
@@ -2370,7 +2654,7 @@
         <w:ind w:left="360"/>
       </w:pPr>
       <w:r>
-        <w:t>POST /api/notifications/bulk-decide — Bulk-beslissing op meerdere meldingen tegelijk.</w:t>
+        <w:t>POST /api/notifications/:id/bulk-decide — Bulk-beslissing op meerdere meldingen tegelijk.</w:t>
       </w:r>
     </w:p>
     <w:p>
@@ -2388,7 +2672,7 @@
         <w:ind w:left="360"/>
       </w:pPr>
       <w:r>
-        <w:t>GET /api/notifications/:id/attachments — Bijlagen ophalen; bestanden staan op /uploads/.</w:t>
+        <w:t>GET /api/notifications/:id/attachments — Bijlagen ophalen (Supabase Storage in productie, lokale /uploads/ in dev).</w:t>
       </w:r>
     </w:p>
     <w:p>
@@ -2417,6 +2701,15 @@
         <w:ind w:left="360"/>
       </w:pPr>
       <w:r>
+        <w:t>PATCH /api/tasks/:id/flags — Vlaggen bijwerken (msi_active, needs_followup, needs_extra_info).</w:t>
+      </w:r>
+    </w:p>
+    <w:p>
+      <w:pPr>
+        <w:pStyle w:val="ListBullet"/>
+        <w:ind w:left="360"/>
+      </w:pPr>
+      <w:r>
         <w:t>PUT /api/tasks/:taskId/products/:productId — Productstatus per taak bijwerken (te_verwerken → voltooid).</w:t>
       </w:r>
     </w:p>
@@ -2426,7 +2719,7 @@
         <w:ind w:left="360"/>
       </w:pPr>
       <w:r>
-        <w:t>POST /api/tasks/:id/translate — Artikeltekst vertalen via Google Cloud Translate.</w:t>
+        <w:t>POST /api/tasks/:id/articles/translate — Artikeltekst vertalen via Google Cloud Translate.</w:t>
       </w:r>
     </w:p>
     <w:p>
@@ -2436,6 +2729,15 @@
       </w:pPr>
       <w:r>
         <w:t>GET /api/tasks/:id/hpd-project — CARIS HPD-projectinfo ophalen.</w:t>
+      </w:r>
+    </w:p>
+    <w:p>
+      <w:pPr>
+        <w:pStyle w:val="ListBullet"/>
+        <w:ind w:left="360"/>
+      </w:pPr>
+      <w:r>
+        <w:t>GET /api/tasks/lead-times — Doorlooptijden per productielijn (gebruikt door de /lead-times pagina).</w:t>
       </w:r>
     </w:p>
     <w:p>
@@ -2456,6 +2758,15 @@
       </w:pPr>
       <w:r>
         <w:t>POST /api/product-versions/:id/publish — Versie publiceren; niet-voltooide taken worden automatisch doorgeschoven naar de volgende versie.</w:t>
+      </w:r>
+    </w:p>
+    <w:p>
+      <w:pPr>
+        <w:pStyle w:val="ListBullet"/>
+        <w:ind w:left="360"/>
+      </w:pPr>
+      <w:r>
+        <w:t>PATCH /api/product-versions/:id/tasks/:taskId/execution-status — Uitvoeringsstatus van een taak binnen een versie bijwerken.</w:t>
       </w:r>
     </w:p>
     <w:p>
@@ -2666,7 +2977,7 @@
           </w:tcPr>
           <w:p>
             <w:r>
-              <w:t>✅ MIME-typecheck + max 10 MB</w:t>
+              <w:t>✅ MIME-typecheck + max 50 MB</w:t>
             </w:r>
           </w:p>
         </w:tc>
@@ -2736,7 +3047,7 @@
           </w:tcPr>
           <w:p>
             <w:r>
-              <w:t>⚠️ Deels via express-validator; verder uitbreiden</w:t>
+              <w:t>⚠️ express-validator is als dependency aanwezig maar wordt nergens gebruikt; alleen gerichte HTML-sanitization in de notities-route</w:t>
             </w:r>
           </w:p>
         </w:tc>
@@ -2879,7 +3190,7 @@
           </w:tcPr>
           <w:p>
             <w:r>
-              <w:t>Statistieken: openstaande meldingen, actieve taken; overzichtswidgets per productielijn</w:t>
+              <w:t>Statistieken: openstaande meldingen, actieve taken; overzichtswidgets per productielijn; persoonlijke dashboard-notities</w:t>
             </w:r>
           </w:p>
         </w:tc>
@@ -2925,7 +3236,7 @@
           </w:tcPr>
           <w:p>
             <w:r>
-              <w:t>Meldingdetail: kaart (14 WMS-lagen), bijlagen, commentaren, coördinaten, zones, gekoppelde producten</w:t>
+              <w:t>Meldingdetail: kaart (14 WMS-lagen), bijlagen, commentaren, coördinaten, zones, gekoppelde producten, info-aanvragen</w:t>
             </w:r>
           </w:p>
         </w:tc>
@@ -2983,6 +3294,29 @@
           </w:tcPr>
           <w:p>
             <w:r>
+              <w:t>/lead-times</w:t>
+            </w:r>
+          </w:p>
+        </w:tc>
+        <w:tc>
+          <w:tcPr>
+            <w:tcW w:type="dxa" w:w="5760"/>
+          </w:tcPr>
+          <w:p>
+            <w:r>
+              <w:t>Doorlooptijden-dashboard: gemiddelde verwerkingstijd per productielijn/status</w:t>
+            </w:r>
+          </w:p>
+        </w:tc>
+      </w:tr>
+      <w:tr>
+        <w:tc>
+          <w:tcPr>
+            <w:tcW w:type="dxa" w:w="4032"/>
+            <w:shd w:val="clear" w:color="auto" w:fill="EEF4FB"/>
+          </w:tcPr>
+          <w:p>
+            <w:r>
               <w:t>/products</w:t>
             </w:r>
           </w:p>
@@ -2990,6 +3324,7 @@
         <w:tc>
           <w:tcPr>
             <w:tcW w:type="dxa" w:w="5760"/>
+            <w:shd w:val="clear" w:color="auto" w:fill="EEF4FB"/>
           </w:tcPr>
           <w:p>
             <w:r>
@@ -3002,7 +3337,6 @@
         <w:tc>
           <w:tcPr>
             <w:tcW w:type="dxa" w:w="4032"/>
-            <w:shd w:val="clear" w:color="auto" w:fill="EEF4FB"/>
           </w:tcPr>
           <w:p>
             <w:r>
@@ -3013,7 +3347,6 @@
         <w:tc>
           <w:tcPr>
             <w:tcW w:type="dxa" w:w="5760"/>
-            <w:shd w:val="clear" w:color="auto" w:fill="EEF4FB"/>
           </w:tcPr>
           <w:p>
             <w:r>
@@ -3026,6 +3359,7 @@
         <w:tc>
           <w:tcPr>
             <w:tcW w:type="dxa" w:w="4032"/>
+            <w:shd w:val="clear" w:color="auto" w:fill="EEF4FB"/>
           </w:tcPr>
           <w:p>
             <w:r>
@@ -3036,6 +3370,7 @@
         <w:tc>
           <w:tcPr>
             <w:tcW w:type="dxa" w:w="5760"/>
+            <w:shd w:val="clear" w:color="auto" w:fill="EEF4FB"/>
           </w:tcPr>
           <w:p>
             <w:r>
@@ -3199,7 +3534,7 @@
           </w:tcPr>
           <w:p>
             <w:r>
-              <w:t>Drag &amp; drop, MIME-validatie, max 10 MB; bestandslijst met download/verwijder</w:t>
+              <w:t>Drag &amp; drop, MIME-validatie, max 50 MB; bestandslijst met download/verwijder</w:t>
             </w:r>
           </w:p>
         </w:tc>
@@ -3235,7 +3570,7 @@
           </w:tcPr>
           <w:p>
             <w:r>
-              <w:t>QuillEditor</w:t>
+              <w:t>SunEditor</w:t>
             </w:r>
           </w:p>
         </w:tc>
@@ -3245,36 +3580,22 @@
           </w:tcPr>
           <w:p>
             <w:r>
-              <w:t>Rich-text editor voor commentaren</w:t>
-            </w:r>
-          </w:p>
-        </w:tc>
-      </w:tr>
-      <w:tr>
-        <w:tc>
-          <w:tcPr>
-            <w:tcW w:type="dxa" w:w="2880"/>
-            <w:shd w:val="clear" w:color="auto" w:fill="EEF4FB"/>
-          </w:tcPr>
-          <w:p>
-            <w:r>
-              <w:t>SunEditor</w:t>
-            </w:r>
-          </w:p>
-        </w:tc>
-        <w:tc>
-          <w:tcPr>
-            <w:tcW w:type="dxa" w:w="6912"/>
-            <w:shd w:val="clear" w:color="auto" w:fill="EEF4FB"/>
-          </w:tcPr>
-          <w:p>
-            <w:r>
-              <w:t>WYSIWYG voor meldingstoelichting en artikelen</w:t>
+              <w:t>WYSIWYG voor meldingstoelichting, artikelen, commentaren en dashboard-notities</w:t>
             </w:r>
           </w:p>
         </w:tc>
       </w:tr>
     </w:tbl>
+    <w:p>
+      <w:r>
+        <w:rPr>
+          <w:b w:val="0"/>
+          <w:i/>
+          <w:sz w:val="18"/>
+        </w:rPr>
+        <w:t>Opmerking: er bestaat nog een lege, ongebruikte QuillEditor.tsx-component in de codebase (dode code, wordt nergens geïmporteerd) — alle rich-text bewerking loopt in de praktijk via SunEditor.</w:t>
+      </w:r>
+    </w:p>
     <w:p>
       <w:pPr>
         <w:pStyle w:val="Heading2"/>
@@ -3816,7 +4137,7 @@
           </w:tcPr>
           <w:p>
             <w:r>
-              <w:t>Automatische bevraging van nautische bericht-API's (MRCC, BASS, POAB, FLARIS NtS) — configuratie aanwezig, import in ontwikkeling</w:t>
+              <w:t>Automatische bevraging van nautische bericht-API's (MRCC, BASS, POAB, FLARIS NtS) — alleen .env-configuratie aanwezig, geen implementatie</w:t>
             </w:r>
           </w:p>
         </w:tc>
@@ -3840,7 +4161,7 @@
           </w:tcPr>
           <w:p>
             <w:r>
-              <w:t>Automatisch inlezen uit nautinfo@mow.vlaanderen.be — Nodemailer geconfigureerd, import in ontwikkeling</w:t>
+              <w:t>Automatisch inlezen uit nautinfo@mow.vlaanderen.be — nodemailer staat als dependency maar wordt nergens aangeroepen; geen implementatie</w:t>
             </w:r>
           </w:p>
         </w:tc>
@@ -3862,7 +4183,7 @@
           </w:tcPr>
           <w:p>
             <w:r>
-              <w:t>Formulier + drag-and-drop van mails; velden automatisch ingevuld uit mail-metadata; bijlagen meeopgeslagen</w:t>
+              <w:t>Formulier + drag-and-drop van .msg/.eml-bestanden, client-side geparsed (msgreader/postal-mime); velden automatisch ingevuld uit mail-metadata; bijlagen meeopgeslagen</w:t>
             </w:r>
           </w:p>
         </w:tc>
@@ -3908,7 +4229,7 @@
           </w:tcPr>
           <w:p>
             <w:r>
-              <w:t>Wrakkendatabank, POSEIDON peilingen — gepland</w:t>
+              <w:t>Wrakkendatabank, POSEIDON peilingen — gepland, nog geen implementatie</w:t>
             </w:r>
           </w:p>
         </w:tc>
@@ -4027,7 +4348,7 @@
         <w:ind w:left="360"/>
       </w:pPr>
       <w:r>
-        <w:t>✅  Bijlagen uploaden (drag &amp; drop, max 10 MB), beheren en downloaden</w:t>
+        <w:t>✅  Bijlagen uploaden (drag &amp; drop, max 50 MB, incl. CAD/GIS-formaten), beheren en downloaden</w:t>
       </w:r>
     </w:p>
     <w:p>
@@ -4064,6 +4385,15 @@
       </w:pPr>
       <w:r>
         <w:t>✅  Commentaarsysteem (toevoegen, bewerken, verwijderen)</w:t>
+      </w:r>
+    </w:p>
+    <w:p>
+      <w:pPr>
+        <w:pStyle w:val="ListBullet"/>
+        <w:ind w:left="360"/>
+      </w:pPr>
+      <w:r>
+        <w:t>✅  Informatie-aanvragen bijhouden (metadata, geen automatische verzending)</w:t>
       </w:r>
     </w:p>
     <w:p>
@@ -4405,6 +4735,44 @@
         <w:t>✅  Sorteerbare kolommen (versienummer, datum, status)</w:t>
       </w:r>
     </w:p>
+    <w:p>
+      <w:pPr>
+        <w:pStyle w:val="Heading2"/>
+      </w:pPr>
+      <w:r>
+        <w:rPr>
+          <w:color w:val="2E74B5"/>
+        </w:rPr>
+        <w:t>7.5 Dashboard &amp; doorlooptijden</w:t>
+      </w:r>
+    </w:p>
+    <w:p>
+      <w:pPr>
+        <w:pStyle w:val="ListBullet"/>
+        <w:ind w:left="360"/>
+      </w:pPr>
+      <w:r>
+        <w:t>✅  Persoonlijke dashboard-notities met prioriteit (laag/gemiddeld/hoog), zichtbaar per gekozen productielijn(en)</w:t>
+      </w:r>
+    </w:p>
+    <w:p>
+      <w:pPr>
+        <w:pStyle w:val="ListBullet"/>
+        <w:ind w:left="360"/>
+      </w:pPr>
+      <w:r>
+        <w:t>✅  Doorlooptijden-pagina (/lead-times): gemiddelde verwerkingsduur van taken per productielijn en status</w:t>
+      </w:r>
+    </w:p>
+    <w:p>
+      <w:pPr>
+        <w:pStyle w:val="ListBullet"/>
+        <w:ind w:left="360"/>
+      </w:pPr>
+      <w:r>
+        <w:t>✅  Statusverdeling van taken als taartdiagram (TaskCharts)</w:t>
+      </w:r>
+    </w:p>
     <w:p/>
     <w:p>
       <w:pPr>
@@ -4535,7 +4903,7 @@
         <w:ind w:left="360"/>
       </w:pPr>
       <w:r>
-        <w:t>⚠️  Automatische mail-import (nautinfo mailbox) — Nodemailer geconfigureerd, import nog niet volledig</w:t>
+        <w:t>✅  Doorlooptijden-dashboard (/lead-times, GET /api/tasks/lead-times)</w:t>
       </w:r>
     </w:p>
     <w:p>
@@ -4544,7 +4912,16 @@
         <w:ind w:left="360"/>
       </w:pPr>
       <w:r>
-        <w:t>⚠️  REST API-integraties (MRCC, BASS, POAB, FLARIS) — .env-configuratie aanwezig, endpoints in ontwikkeling</w:t>
+        <w:t>⚠️  Automatische mail-import (nautinfo mailbox) — alleen .env-configuratie; nodemailer is niet geïmplementeerd. Handmatige drag-and-drop van .msg/.eml is wel volledig functioneel.</w:t>
+      </w:r>
+    </w:p>
+    <w:p>
+      <w:pPr>
+        <w:pStyle w:val="ListBullet"/>
+        <w:ind w:left="360"/>
+      </w:pPr>
+      <w:r>
+        <w:t>⚠️  REST API-integraties (MRCC, BASS, POAB, FLARIS) — alleen .env-configuratie aanwezig, geen endpoints/polling geïmplementeerd</w:t>
       </w:r>
     </w:p>
     <w:p>
@@ -4565,15 +4942,6 @@
       </w:pPr>
       <w:r>
         <w:t>🔲  Pushberichten (Wrakkendatabank, POSEIDON)</w:t>
-      </w:r>
-    </w:p>
-    <w:p>
-      <w:pPr>
-        <w:pStyle w:val="ListBullet"/>
-        <w:ind w:left="360"/>
-      </w:pPr>
-      <w:r>
-        <w:t>🔲  Doorlooptijden-tracking (tijdregistratie/flow)</w:t>
       </w:r>
     </w:p>
     <w:p>
@@ -4829,7 +5197,7 @@
           </w:tcPr>
           <w:p>
             <w:r>
-              <w:t>Nautinfo mailbox</w:t>
+              <w:t>Supabase (PostgreSQL + Storage)</w:t>
             </w:r>
           </w:p>
         </w:tc>
@@ -4839,7 +5207,7 @@
           </w:tcPr>
           <w:p>
             <w:r>
-              <w:t>nautinfo@mow.vlaanderen.be — Nodemailer geconfigureerd; automatische import in ontwikkeling.</w:t>
+              <w:t>Database-hosting (PostGIS) en bijlage-opslag in productie. Status: geïmplementeerd.</w:t>
             </w:r>
           </w:p>
         </w:tc>
@@ -4852,7 +5220,7 @@
           </w:tcPr>
           <w:p>
             <w:r>
-              <w:t>MRCC Oostende (MSI)</w:t>
+              <w:t>Nautinfo mailbox</w:t>
             </w:r>
           </w:p>
         </w:tc>
@@ -4863,7 +5231,7 @@
           </w:tcPr>
           <w:p>
             <w:r>
-              <w:t>Maritime Safety Information API; .env-configuratie aanwezig; endpoints in ontwikkeling.</w:t>
+              <w:t>nautinfo@mow.vlaanderen.be — nodemailer staat als dependency, maar er is geen mailbox-integratie geïmplementeerd. Status: niet geïmplementeerd (enkel .env-plek voorzien).</w:t>
             </w:r>
           </w:p>
         </w:tc>
@@ -4875,7 +5243,7 @@
           </w:tcPr>
           <w:p>
             <w:r>
-              <w:t>VTS Scheldt (BASS)</w:t>
+              <w:t>MRCC Oostende (MSI)</w:t>
             </w:r>
           </w:p>
         </w:tc>
@@ -4885,7 +5253,7 @@
           </w:tcPr>
           <w:p>
             <w:r>
-              <w:t>Bekendmaking aan de Scheepvaart Scheldegebied; in ontwikkeling.</w:t>
+              <w:t>Maritime Safety Information API; .env-configuratie aanwezig; geen implementatie.</w:t>
             </w:r>
           </w:p>
         </w:tc>
@@ -4898,7 +5266,7 @@
           </w:tcPr>
           <w:p>
             <w:r>
-              <w:t>Port of Antwerp-Bruges (POAB)</w:t>
+              <w:t>VTS Scheldt (BASS)</w:t>
             </w:r>
           </w:p>
         </w:tc>
@@ -4909,7 +5277,7 @@
           </w:tcPr>
           <w:p>
             <w:r>
-              <w:t>Nautische berichten; in ontwikkeling.</w:t>
+              <w:t>Bekendmaking aan de Scheepvaart Scheldegebied; geen implementatie.</w:t>
             </w:r>
           </w:p>
         </w:tc>
@@ -4921,7 +5289,7 @@
           </w:tcPr>
           <w:p>
             <w:r>
-              <w:t>EuRIS (FLARIS NtS)</w:t>
+              <w:t>Port of Antwerp-Bruges (POAB)</w:t>
             </w:r>
           </w:p>
         </w:tc>
@@ -4931,7 +5299,7 @@
           </w:tcPr>
           <w:p>
             <w:r>
-              <w:t>Inland waterway notices; in ontwikkeling.</w:t>
+              <w:t>Nautische berichten; geen implementatie.</w:t>
             </w:r>
           </w:p>
         </w:tc>
@@ -4944,6 +5312,29 @@
           </w:tcPr>
           <w:p>
             <w:r>
+              <w:t>EuRIS (FLARIS NtS)</w:t>
+            </w:r>
+          </w:p>
+        </w:tc>
+        <w:tc>
+          <w:tcPr>
+            <w:tcW w:type="dxa" w:w="6624"/>
+            <w:shd w:val="clear" w:color="auto" w:fill="EEF4FB"/>
+          </w:tcPr>
+          <w:p>
+            <w:r>
+              <w:t>Inland waterway notices; geen implementatie.</w:t>
+            </w:r>
+          </w:p>
+        </w:tc>
+      </w:tr>
+      <w:tr>
+        <w:tc>
+          <w:tcPr>
+            <w:tcW w:type="dxa" w:w="3168"/>
+          </w:tcPr>
+          <w:p>
+            <w:r>
               <w:t>Wrakkendatabank</w:t>
             </w:r>
           </w:p>
@@ -4951,7 +5342,6 @@
         <w:tc>
           <w:tcPr>
             <w:tcW w:type="dxa" w:w="6624"/>
-            <w:shd w:val="clear" w:color="auto" w:fill="EEF4FB"/>
           </w:tcPr>
           <w:p>
             <w:r>
@@ -4964,6 +5354,7 @@
         <w:tc>
           <w:tcPr>
             <w:tcW w:type="dxa" w:w="3168"/>
+            <w:shd w:val="clear" w:color="auto" w:fill="EEF4FB"/>
           </w:tcPr>
           <w:p>
             <w:r>
@@ -4974,6 +5365,7 @@
         <w:tc>
           <w:tcPr>
             <w:tcW w:type="dxa" w:w="6624"/>
+            <w:shd w:val="clear" w:color="auto" w:fill="EEF4FB"/>
           </w:tcPr>
           <w:p>
             <w:r>
@@ -5005,6 +5397,16 @@
       </w:r>
     </w:p>
     <w:p>
+      <w:r>
+        <w:rPr>
+          <w:b w:val="0"/>
+          <w:i w:val="0"/>
+          <w:sz w:val="22"/>
+        </w:rPr>
+        <w:t>De productieomgeving draait op Vercel (serverless API + statische front-end build), met de database en bijlage-opslag op Supabase. Onderstaande stappen beschrijven een lokale ontwikkelopstelling tegen een eigen PostgreSQL-instantie of tegen een Supabase-project.</w:t>
+      </w:r>
+    </w:p>
+    <w:p>
       <w:pPr>
         <w:pStyle w:val="Heading2"/>
       </w:pPr>
@@ -5030,7 +5432,7 @@
         <w:ind w:left="360"/>
       </w:pPr>
       <w:r>
-        <w:t>PostgreSQL 15+ met PostGIS extensie</w:t>
+        <w:t>PostgreSQL 15+ met PostGIS extensie (lokaal, of een Supabase-project)</w:t>
       </w:r>
     </w:p>
     <w:p>
@@ -5371,7 +5773,7 @@
         <w:ind w:left="360"/>
       </w:pPr>
       <w:r>
-        <w:t>Frontend: http://localhost:5173</w:t>
+        <w:t>Frontend (lokaal): http://localhost:5173</w:t>
       </w:r>
     </w:p>
     <w:p>
@@ -5380,7 +5782,7 @@
         <w:ind w:left="360"/>
       </w:pPr>
       <w:r>
-        <w:t>Backend API: http://localhost:3000</w:t>
+        <w:t>Backend API (lokaal): http://localhost:3000</w:t>
       </w:r>
     </w:p>
     <w:p>
@@ -5398,7 +5800,7 @@
         <w:ind w:left="360"/>
       </w:pPr>
       <w:r>
-        <w:t>Standaard login: test@cartis.be / test123</w:t>
+        <w:t>Productieomgeving: Vercel-deployment gekoppeld aan het Supabase-project (zie VERCEL_*.md / DEPLOYMENT.md)</w:t>
       </w:r>
     </w:p>
     <w:p/>
@@ -5429,7 +5831,7 @@
           <w:i w:val="0"/>
           <w:sz w:val="22"/>
         </w:rPr>
-        <w:t>CARTIS 2.0 is een volledig functionele webapplicatie voor de administratieve opvolging van nautische meldingen bij Vlaamse Hydrografie. De applicatie dekt de vier kernprocessen (Meldingen, Taken, Productversies, Publicaties) voor vier productielijnen (ZK, IENC, PILOT_ENC, PUBL). De technische stack — Node.js/Express back-end met PostgreSQL/PostGIS en React/TypeScript front-end — biedt een solide basis voor verdere uitbreiding.</w:t>
+        <w:t>CARTIS 2.0 is een volledig functionele webapplicatie voor de administratieve opvolging van nautische meldingen bij Vlaamse Hydrografie. De applicatie dekt de vier kernprocessen (Meldingen, Taken, Productversies, Publicaties) voor vier productielijnen (ZK, IENC, PILOT_ENC, PUBL). De technische stack — Node.js/Express back-end met PostgreSQL/PostGIS op Supabase en een React/TypeScript front-end, gedeployed op Vercel — biedt een solide basis voor verdere uitbreiding.</w:t>
       </w:r>
     </w:p>
     <w:p/>
@@ -5449,7 +5851,7 @@
         <w:ind w:left="360"/>
       </w:pPr>
       <w:r>
-        <w:t>✅  Volledig operationele monorepo met gescheiden back-end en front-end</w:t>
+        <w:t>✅  Volledig operationele monorepo met gescheiden back-end en front-end, in productie op Vercel + Supabase</w:t>
       </w:r>
     </w:p>
     <w:p>
@@ -5458,7 +5860,7 @@
         <w:ind w:left="360"/>
       </w:pPr>
       <w:r>
-        <w:t>✅  Robuust databaseschema (20+ tabellen) met audit trail en rol-gebaseerde rechten</w:t>
+        <w:t>✅  Robuust databaseschema (24+ tabellen) met audit trail en rol-gebaseerde rechten</w:t>
       </w:r>
     </w:p>
     <w:p>
@@ -5467,7 +5869,7 @@
         <w:ind w:left="360"/>
       </w:pPr>
       <w:r>
-        <w:t>✅  70+ REST-endpoints met JWT-beveiliging en parameterized queries</w:t>
+        <w:t>✅  78+ REST-endpoints met JWT-beveiliging en parameterized queries</w:t>
       </w:r>
     </w:p>
     <w:p>
@@ -5504,6 +5906,15 @@
       </w:pPr>
       <w:r>
         <w:t>✅  CARIS HPD-koppeling en Google Translate-integratie voor meertalige artikelen</w:t>
+      </w:r>
+    </w:p>
+    <w:p>
+      <w:pPr>
+        <w:pStyle w:val="ListBullet"/>
+        <w:ind w:left="360"/>
+      </w:pPr>
+      <w:r>
+        <w:t>✅  Doorlooptijden-dashboard en persoonlijke dashboard-notities</w:t>
       </w:r>
     </w:p>
     <w:p>
@@ -5532,7 +5943,7 @@
         <w:ind w:left="360"/>
       </w:pPr>
       <w:r>
-        <w:t>🔲  Implementeer rate limiting en volledige input sanitization (OWASP Prio)</w:t>
+        <w:t>🔲  Implementeer rate limiting en volledige input sanitization (express-validator is aanwezig als dependency maar wordt nergens gebruikt) (OWASP Prio)</w:t>
       </w:r>
     </w:p>
     <w:p>
@@ -5541,7 +5952,16 @@
         <w:ind w:left="360"/>
       </w:pPr>
       <w:r>
-        <w:t>🔲  Automatische mail-import en REST API-integraties (MRCC, BASS, POAB, FLARIS) voltooien</w:t>
+        <w:t>🔲  CSRF-beveiliging toevoegen</w:t>
+      </w:r>
+    </w:p>
+    <w:p>
+      <w:pPr>
+        <w:pStyle w:val="ListBullet"/>
+        <w:ind w:left="360"/>
+      </w:pPr>
+      <w:r>
+        <w:t>🔲  Automatische mail-import en REST API-integraties (MRCC, BASS, POAB, FLARIS) zijn nog niet gestart (enkel .env-configuratie aanwezig)</w:t>
       </w:r>
     </w:p>
     <w:p>
@@ -5577,7 +5997,16 @@
         <w:ind w:left="360"/>
       </w:pPr>
       <w:r>
-        <w:t>🔲  Doorlooptijden-tracking en pushberichten (Wrakkendatabank, POSEIDON) plannen</w:t>
+        <w:t>🔲  Pushberichten (Wrakkendatabank, POSEIDON) plannen</w:t>
+      </w:r>
+    </w:p>
+    <w:p>
+      <w:pPr>
+        <w:pStyle w:val="ListBullet"/>
+        <w:ind w:left="360"/>
+      </w:pPr>
+      <w:r>
+        <w:t>🔲  Opruimen van dode code (bv. lege QuillEditor.tsx-component)</w:t>
       </w:r>
     </w:p>
     <w:p/>
@@ -5592,7 +6021,7 @@
           <w:color w:val="888888"/>
           <w:sz w:val="18"/>
         </w:rPr>
-        <w:t>CARTIS 2.0 — Analyse &amp; Technische Documentatie — April 2026 — Vlaamse Hydrografie</w:t>
+        <w:t>CARTIS 2.0 — Analyse &amp; Technische Documentatie — April 2026 (bijgewerkt augustus 2026) — Vlaamse Hydrografie</w:t>
       </w:r>
     </w:p>
     <w:sectPr>

</xml_diff>